<commit_message>
Refine topic outputs and reporting structure
</commit_message>
<xml_diff>
--- a/outputs/reports/study1_manuscript_support.docx
+++ b/outputs/reports/study1_manuscript_support.docx
@@ -2,7 +2,7 @@
 <file path=word/document.xml><?xml version="1.0" encoding="utf-8"?>
 <w:document xmlns:w="http://schemas.openxmlformats.org/wordprocessingml/2006/main" xmlns:m="http://schemas.openxmlformats.org/officeDocument/2006/math" xmlns:r="http://schemas.openxmlformats.org/officeDocument/2006/relationships" xmlns:o="urn:schemas-microsoft-com:office:office" xmlns:v="urn:schemas-microsoft-com:vml" xmlns:w10="urn:schemas-microsoft-com:office:word" xmlns:a="http://schemas.openxmlformats.org/drawingml/2006/main" xmlns:pic="http://schemas.openxmlformats.org/drawingml/2006/picture" xmlns:wp="http://schemas.openxmlformats.org/drawingml/2006/wordprocessingDrawing">
   <w:body>
-    <w:bookmarkStart w:id="48" w:name="study-1-manuscript-support-document"/>
+    <w:bookmarkStart w:id="49" w:name="study-1-manuscript-support-document"/>
     <w:p>
       <w:pPr>
         <w:pStyle w:val="Heading1"/>
@@ -321,7 +321,7 @@
         <w:pStyle w:val="Compact"/>
       </w:pPr>
       <w:r>
-        <w:t xml:space="preserve">In-Store Experience, Exchanges &amp; Returns</w:t>
+        <w:t xml:space="preserve">Payment, Vouchers &amp; Website Issues</w:t>
       </w:r>
     </w:p>
     <w:p>
@@ -333,6 +333,30 @@
         <w:pStyle w:val="Compact"/>
       </w:pPr>
       <w:r>
+        <w:t xml:space="preserve">Product Quality, Size &amp; Wrong Items</w:t>
+      </w:r>
+    </w:p>
+    <w:p>
+      <w:pPr>
+        <w:numPr>
+          <w:ilvl w:val="0"/>
+          <w:numId w:val="1003"/>
+        </w:numPr>
+        <w:pStyle w:val="Compact"/>
+      </w:pPr>
+      <w:r>
+        <w:t xml:space="preserve">Gift Cards, Refunds &amp; Payment Recovery</w:t>
+      </w:r>
+    </w:p>
+    <w:p>
+      <w:pPr>
+        <w:numPr>
+          <w:ilvl w:val="0"/>
+          <w:numId w:val="1003"/>
+        </w:numPr>
+        <w:pStyle w:val="Compact"/>
+      </w:pPr>
+      <w:r>
         <w:t xml:space="preserve">Customer Service Failures &amp; Staff Conduct</w:t>
       </w:r>
     </w:p>
@@ -345,7 +369,7 @@
         <w:pStyle w:val="Compact"/>
       </w:pPr>
       <w:r>
-        <w:t xml:space="preserve">Product Quality, Size &amp; Wrong Items</w:t>
+        <w:t xml:space="preserve">Delivery, Non-Receipt &amp; Shipping Delays</w:t>
       </w:r>
     </w:p>
     <w:p>
@@ -357,31 +381,7 @@
         <w:pStyle w:val="Compact"/>
       </w:pPr>
       <w:r>
-        <w:t xml:space="preserve">Refunds, Contact &amp; Service Recovery</w:t>
-      </w:r>
-    </w:p>
-    <w:p>
-      <w:pPr>
-        <w:numPr>
-          <w:ilvl w:val="0"/>
-          <w:numId w:val="1003"/>
-        </w:numPr>
-        <w:pStyle w:val="Compact"/>
-      </w:pPr>
-      <w:r>
-        <w:t xml:space="preserve">Order Delays, Shipping &amp; Cancellation</w:t>
-      </w:r>
-    </w:p>
-    <w:p>
-      <w:pPr>
-        <w:numPr>
-          <w:ilvl w:val="0"/>
-          <w:numId w:val="1003"/>
-        </w:numPr>
-        <w:pStyle w:val="Compact"/>
-      </w:pPr>
-      <w:r>
-        <w:t xml:space="preserve">Delivery, Non-Receipt &amp; Parcel Problems</w:t>
+        <w:t xml:space="preserve">Returns, Refunds &amp; Service Recovery</w:t>
       </w:r>
     </w:p>
     <w:p>
@@ -409,7 +409,7 @@
         <w:pStyle w:val="Compact"/>
       </w:pPr>
       <w:r>
-        <w:t xml:space="preserve">H&amp;M is most strongly associated with Order Delays, Shipping &amp; Cancellation.</w:t>
+        <w:t xml:space="preserve">H&amp;M is most strongly associated with Delivery, Non-Receipt &amp; Shipping Delays.</w:t>
       </w:r>
     </w:p>
     <w:p>
@@ -421,7 +421,7 @@
         <w:pStyle w:val="Compact"/>
       </w:pPr>
       <w:r>
-        <w:t xml:space="preserve">ZARA is most strongly associated with In-Store Experience, Exchanges &amp; Returns and Customer Service Failures &amp; Staff Conduct.</w:t>
+        <w:t xml:space="preserve">ZARA is most strongly associated with Customer Service Failures &amp; Staff Conduct.</w:t>
       </w:r>
     </w:p>
     <w:p>
@@ -433,7 +433,7 @@
         <w:pStyle w:val="Compact"/>
       </w:pPr>
       <w:r>
-        <w:t xml:space="preserve">SHEIN is dominated by Refunds, Contact &amp; Service Recovery.</w:t>
+        <w:t xml:space="preserve">SHEIN is dominated by Returns, Refunds &amp; Service Recovery.</w:t>
       </w:r>
     </w:p>
     <w:p>
@@ -445,7 +445,7 @@
         <w:pStyle w:val="Compact"/>
       </w:pPr>
       <w:r>
-        <w:t xml:space="preserve">Urban Outfitters is dominated by Delivery, Non-Receipt &amp; Parcel Problems.</w:t>
+        <w:t xml:space="preserve">Urban Outfitters is dominated by Delivery, Non-Receipt &amp; Shipping Delays.</w:t>
       </w:r>
     </w:p>
     <w:bookmarkEnd w:id="26"/>
@@ -710,7 +710,7 @@
       <w:r>
         <w:drawing>
           <wp:inline>
-            <wp:extent cx="5334000" cy="3818901"/>
+            <wp:extent cx="5334000" cy="2885459"/>
             <wp:effectExtent b="0" l="0" r="0" t="0"/>
             <wp:docPr descr="Figure 3" title="" id="1" name="Picture"/>
             <a:graphic>
@@ -731,7 +731,7 @@
                   <pic:spPr bwMode="auto">
                     <a:xfrm>
                       <a:off x="0" y="0"/>
-                      <a:ext cx="5334000" cy="3818901"/>
+                      <a:ext cx="5334000" cy="2885459"/>
                     </a:xfrm>
                     <a:prstGeom prst="rect">
                       <a:avLst/>
@@ -1114,6 +1114,36 @@
         <w:rPr>
           <w:rStyle w:val="VerbatimChar"/>
         </w:rPr>
+        <w:t xml:space="preserve">outputs/tables/study1_scored_reviews_public.csv</w:t>
+      </w:r>
+    </w:p>
+    <w:p>
+      <w:pPr>
+        <w:numPr>
+          <w:ilvl w:val="0"/>
+          <w:numId w:val="1005"/>
+        </w:numPr>
+        <w:pStyle w:val="Compact"/>
+      </w:pPr>
+      <w:r>
+        <w:rPr>
+          <w:rStyle w:val="VerbatimChar"/>
+        </w:rPr>
+        <w:t xml:space="preserve">outputs/tables/study1_scored_reviews_public.zip</w:t>
+      </w:r>
+    </w:p>
+    <w:p>
+      <w:pPr>
+        <w:numPr>
+          <w:ilvl w:val="0"/>
+          <w:numId w:val="1005"/>
+        </w:numPr>
+        <w:pStyle w:val="Compact"/>
+      </w:pPr>
+      <w:r>
+        <w:rPr>
+          <w:rStyle w:val="VerbatimChar"/>
+        </w:rPr>
         <w:t xml:space="preserve">outputs/tables/study1_publication_workbook.xlsx</w:t>
       </w:r>
     </w:p>
@@ -1144,7 +1174,7 @@
         <w:rPr>
           <w:rStyle w:val="VerbatimChar"/>
         </w:rPr>
-        <w:t xml:space="preserve">reports/draft_methodology_results.md</w:t>
+        <w:t xml:space="preserve">reports/archive/draft_methodology_results.md</w:t>
       </w:r>
     </w:p>
     <w:p>
@@ -1159,17 +1189,17 @@
         <w:rPr>
           <w:rStyle w:val="VerbatimChar"/>
         </w:rPr>
-        <w:t xml:space="preserve">reports/study1_results_section.md</w:t>
+        <w:t xml:space="preserve">reports/archive/study1_results_section.md</w:t>
       </w:r>
     </w:p>
     <w:bookmarkEnd w:id="46"/>
-    <w:bookmarkStart w:id="47" w:name="remaining-steps-before-final-delivery"/>
+    <w:bookmarkStart w:id="47" w:name="public-data-and-privacy"/>
     <w:p>
       <w:pPr>
         <w:pStyle w:val="Heading2"/>
       </w:pPr>
       <w:r>
-        <w:t xml:space="preserve">Remaining Steps Before Final Delivery</w:t>
+        <w:t xml:space="preserve">Public Data and Privacy</w:t>
       </w:r>
     </w:p>
     <w:p>
@@ -1177,7 +1207,25 @@
         <w:pStyle w:val="FirstParagraph"/>
       </w:pPr>
       <w:r>
-        <w:t xml:space="preserve">Before the final GitHub and Word deliverables are packaged, the remaining work is:</w:t>
+        <w:t xml:space="preserve">The GitHub-facing review-level dataset is a sanitized public export. It excludes direct identity and contact columns such as reviewer names, email fields, and phone fields. Review text is also redacted for email addresses and phone numbers before export so that the public repository contains reproducible analysis outputs without exposing identifiable reviewer information. Because GitHub may not preview larger CSV files inline, the repository also includes a zipped copy for easier download.</w:t>
+      </w:r>
+    </w:p>
+    <w:bookmarkEnd w:id="47"/>
+    <w:bookmarkStart w:id="48" w:name="package-status"/>
+    <w:p>
+      <w:pPr>
+        <w:pStyle w:val="Heading2"/>
+      </w:pPr>
+      <w:r>
+        <w:t xml:space="preserve">Package Status</w:t>
+      </w:r>
+    </w:p>
+    <w:p>
+      <w:pPr>
+        <w:pStyle w:val="FirstParagraph"/>
+      </w:pPr>
+      <w:r>
+        <w:t xml:space="preserve">The Study 1 package is now assembled as a reproducible repository that includes:</w:t>
       </w:r>
     </w:p>
     <w:p>
@@ -1189,7 +1237,7 @@
         <w:pStyle w:val="Compact"/>
       </w:pPr>
       <w:r>
-        <w:t xml:space="preserve">Final README polish so the repository reads well as both a publication companion and a portfolio project.</w:t>
+        <w:t xml:space="preserve">The full analysis code and configuration.</w:t>
       </w:r>
     </w:p>
     <w:p>
@@ -1201,7 +1249,7 @@
         <w:pStyle w:val="Compact"/>
       </w:pPr>
       <w:r>
-        <w:t xml:space="preserve">Git initialization and selective commit curation.</w:t>
+        <w:t xml:space="preserve">Final figures and tables.</w:t>
       </w:r>
     </w:p>
     <w:p>
@@ -1213,7 +1261,7 @@
         <w:pStyle w:val="Compact"/>
       </w:pPr>
       <w:r>
-        <w:t xml:space="preserve">A data-sharing decision on whether any processed review-level outputs should be public in GitHub.</w:t>
+        <w:t xml:space="preserve">A sanitized public review-level export for GitHub.</w:t>
       </w:r>
     </w:p>
     <w:p>
@@ -1225,7 +1273,7 @@
         <w:pStyle w:val="Compact"/>
       </w:pPr>
       <w:r>
-        <w:t xml:space="preserve">Creation of the final Word document version of this manuscript-support report.</w:t>
+        <w:t xml:space="preserve">A publication workbook.</w:t>
       </w:r>
     </w:p>
     <w:p>
@@ -1237,11 +1285,11 @@
         <w:pStyle w:val="Compact"/>
       </w:pPr>
       <w:r>
-        <w:t xml:space="preserve">Optional final figure caption polishing and manuscript-specific shortening.</w:t>
-      </w:r>
-    </w:p>
-    <w:bookmarkEnd w:id="47"/>
+        <w:t xml:space="preserve">A Word manuscript-support document and figure appendix PDF.</w:t>
+      </w:r>
+    </w:p>
     <w:bookmarkEnd w:id="48"/>
+    <w:bookmarkEnd w:id="49"/>
     <w:sectPr/>
   </w:body>
 </w:document>

</xml_diff>

<commit_message>
Normalize receive token variants
</commit_message>
<xml_diff>
--- a/outputs/reports/study1_manuscript_support.docx
+++ b/outputs/reports/study1_manuscript_support.docx
@@ -710,7 +710,7 @@
       <w:r>
         <w:drawing>
           <wp:inline>
-            <wp:extent cx="5334000" cy="2885459"/>
+            <wp:extent cx="5334000" cy="2880062"/>
             <wp:effectExtent b="0" l="0" r="0" t="0"/>
             <wp:docPr descr="Figure 3" title="" id="1" name="Picture"/>
             <a:graphic>
@@ -731,7 +731,7 @@
                   <pic:spPr bwMode="auto">
                     <a:xfrm>
                       <a:off x="0" y="0"/>
-                      <a:ext cx="5334000" cy="2885459"/>
+                      <a:ext cx="5334000" cy="2880062"/>
                     </a:xfrm>
                     <a:prstGeom prst="rect">
                       <a:avLst/>

</xml_diff>

<commit_message>
Polish topic token normalization
</commit_message>
<xml_diff>
--- a/outputs/reports/study1_manuscript_support.docx
+++ b/outputs/reports/study1_manuscript_support.docx
@@ -2,7 +2,7 @@
 <file path=word/document.xml><?xml version="1.0" encoding="utf-8"?>
 <w:document xmlns:w="http://schemas.openxmlformats.org/wordprocessingml/2006/main" xmlns:m="http://schemas.openxmlformats.org/officeDocument/2006/math" xmlns:r="http://schemas.openxmlformats.org/officeDocument/2006/relationships" xmlns:o="urn:schemas-microsoft-com:office:office" xmlns:v="urn:schemas-microsoft-com:vml" xmlns:w10="urn:schemas-microsoft-com:office:word" xmlns:a="http://schemas.openxmlformats.org/drawingml/2006/main" xmlns:pic="http://schemas.openxmlformats.org/drawingml/2006/picture" xmlns:wp="http://schemas.openxmlformats.org/drawingml/2006/wordprocessingDrawing">
   <w:body>
-    <w:bookmarkStart w:id="49" w:name="study-1-manuscript-support-document"/>
+    <w:bookmarkStart w:id="48" w:name="study-1-manuscript-support-document"/>
     <w:p>
       <w:pPr>
         <w:pStyle w:val="Heading1"/>
@@ -1035,7 +1035,7 @@
       <w:r>
         <w:drawing>
           <wp:inline>
-            <wp:extent cx="5334000" cy="2322161"/>
+            <wp:extent cx="5334000" cy="2321502"/>
             <wp:effectExtent b="0" l="0" r="0" t="0"/>
             <wp:docPr descr="Figure 8" title="" id="1" name="Picture"/>
             <a:graphic>
@@ -1056,7 +1056,7 @@
                   <pic:spPr bwMode="auto">
                     <a:xfrm>
                       <a:off x="0" y="0"/>
-                      <a:ext cx="5334000" cy="2322161"/>
+                      <a:ext cx="5334000" cy="2321502"/>
                     </a:xfrm>
                     <a:prstGeom prst="rect">
                       <a:avLst/>
@@ -1211,85 +1211,7 @@
       </w:r>
     </w:p>
     <w:bookmarkEnd w:id="47"/>
-    <w:bookmarkStart w:id="48" w:name="package-status"/>
-    <w:p>
-      <w:pPr>
-        <w:pStyle w:val="Heading2"/>
-      </w:pPr>
-      <w:r>
-        <w:t xml:space="preserve">Package Status</w:t>
-      </w:r>
-    </w:p>
-    <w:p>
-      <w:pPr>
-        <w:pStyle w:val="FirstParagraph"/>
-      </w:pPr>
-      <w:r>
-        <w:t xml:space="preserve">The Study 1 package is now assembled as a reproducible repository that includes:</w:t>
-      </w:r>
-    </w:p>
-    <w:p>
-      <w:pPr>
-        <w:numPr>
-          <w:ilvl w:val="0"/>
-          <w:numId w:val="1006"/>
-        </w:numPr>
-        <w:pStyle w:val="Compact"/>
-      </w:pPr>
-      <w:r>
-        <w:t xml:space="preserve">The full analysis code and configuration.</w:t>
-      </w:r>
-    </w:p>
-    <w:p>
-      <w:pPr>
-        <w:numPr>
-          <w:ilvl w:val="0"/>
-          <w:numId w:val="1006"/>
-        </w:numPr>
-        <w:pStyle w:val="Compact"/>
-      </w:pPr>
-      <w:r>
-        <w:t xml:space="preserve">Final figures and tables.</w:t>
-      </w:r>
-    </w:p>
-    <w:p>
-      <w:pPr>
-        <w:numPr>
-          <w:ilvl w:val="0"/>
-          <w:numId w:val="1006"/>
-        </w:numPr>
-        <w:pStyle w:val="Compact"/>
-      </w:pPr>
-      <w:r>
-        <w:t xml:space="preserve">A sanitized public review-level export for GitHub.</w:t>
-      </w:r>
-    </w:p>
-    <w:p>
-      <w:pPr>
-        <w:numPr>
-          <w:ilvl w:val="0"/>
-          <w:numId w:val="1006"/>
-        </w:numPr>
-        <w:pStyle w:val="Compact"/>
-      </w:pPr>
-      <w:r>
-        <w:t xml:space="preserve">A publication workbook.</w:t>
-      </w:r>
-    </w:p>
-    <w:p>
-      <w:pPr>
-        <w:numPr>
-          <w:ilvl w:val="0"/>
-          <w:numId w:val="1006"/>
-        </w:numPr>
-        <w:pStyle w:val="Compact"/>
-      </w:pPr>
-      <w:r>
-        <w:t xml:space="preserve">A Word manuscript-support document and figure appendix PDF.</w:t>
-      </w:r>
-    </w:p>
     <w:bookmarkEnd w:id="48"/>
-    <w:bookmarkEnd w:id="49"/>
     <w:sectPr/>
   </w:body>
 </w:document>
@@ -1628,36 +1550,6 @@
   </w:num>
   <w:num w:numId="1005">
     <w:abstractNumId w:val="991"/>
-  </w:num>
-  <w:num w:numId="1006">
-    <w:abstractNumId w:val="99411"/>
-    <w:lvlOverride w:ilvl="0">
-      <w:startOverride w:val="1"/>
-    </w:lvlOverride>
-    <w:lvlOverride w:ilvl="1">
-      <w:startOverride w:val="1"/>
-    </w:lvlOverride>
-    <w:lvlOverride w:ilvl="2">
-      <w:startOverride w:val="1"/>
-    </w:lvlOverride>
-    <w:lvlOverride w:ilvl="3">
-      <w:startOverride w:val="1"/>
-    </w:lvlOverride>
-    <w:lvlOverride w:ilvl="4">
-      <w:startOverride w:val="1"/>
-    </w:lvlOverride>
-    <w:lvlOverride w:ilvl="5">
-      <w:startOverride w:val="1"/>
-    </w:lvlOverride>
-    <w:lvlOverride w:ilvl="6">
-      <w:startOverride w:val="1"/>
-    </w:lvlOverride>
-    <w:lvlOverride w:ilvl="7">
-      <w:startOverride w:val="1"/>
-    </w:lvlOverride>
-    <w:lvlOverride w:ilvl="8">
-      <w:startOverride w:val="1"/>
-    </w:lvlOverride>
   </w:num>
 </w:numbering>
 </file>

</xml_diff>

<commit_message>
Refine remaining topic token labels
</commit_message>
<xml_diff>
--- a/outputs/reports/study1_manuscript_support.docx
+++ b/outputs/reports/study1_manuscript_support.docx
@@ -1035,7 +1035,7 @@
       <w:r>
         <w:drawing>
           <wp:inline>
-            <wp:extent cx="5334000" cy="2321502"/>
+            <wp:extent cx="5334000" cy="2322161"/>
             <wp:effectExtent b="0" l="0" r="0" t="0"/>
             <wp:docPr descr="Figure 8" title="" id="1" name="Picture"/>
             <a:graphic>
@@ -1056,7 +1056,7 @@
                   <pic:spPr bwMode="auto">
                     <a:xfrm>
                       <a:off x="0" y="0"/>
-                      <a:ext cx="5334000" cy="2321502"/>
+                      <a:ext cx="5334000" cy="2322161"/>
                     </a:xfrm>
                     <a:prstGeom prst="rect">
                       <a:avLst/>

</xml_diff>